<commit_message>
add two-stage patent workflow
</commit_message>
<xml_diff>
--- a/templates/专利模板.docx
+++ b/templates/专利模板.docx
@@ -4,40 +4,26 @@
   <w:body>
     <w:p>
       <w:pPr>
-        <w:wordWrap w:val="0"/>
-        <w:spacing w:line="440" w:lineRule="exact"/>
-        <w:rPr>
-          <w:rFonts w:hint="default" w:ascii="Times New Roman" w:hAnsi="Times New Roman" w:eastAsia="仿宋"/>
-          <w:b/>
-          <w:sz w:val="28"/>
-          <w:szCs w:val="28"/>
-          <w:lang w:val="en-US" w:eastAsia="zh-CN"/>
-        </w:rPr>
-      </w:pPr>
-      <w:r>
-        <w:rPr>
-          <w:rFonts w:hint="eastAsia" w:ascii="Times New Roman" w:hAnsi="Times New Roman" w:eastAsia="仿宋"/>
-          <w:b/>
-          <w:sz w:val="28"/>
-          <w:szCs w:val="28"/>
-          <w:lang w:val="en-US" w:eastAsia="zh-CN"/>
-        </w:rPr>
-        <w:t>说明书摘要：</w:t>
-      </w:r>
-    </w:p>
-    <w:p>
-      <w:pPr>
-        <w:wordWrap w:val="0"/>
-        <w:spacing w:line="440" w:lineRule="exact"/>
-        <w:ind w:firstLine="1120" w:firstLineChars="400"/>
-        <w:rPr>
-          <w:rFonts w:hint="eastAsia" w:ascii="Times New Roman" w:hAnsi="Times New Roman" w:eastAsia="仿宋"/>
-          <w:sz w:val="28"/>
-          <w:szCs w:val="28"/>
+        <w:pStyle w:val="2"/>
+        <w:numPr>
+          <w:numId w:val="0"/>
+        </w:numPr>
+        <w:ind w:left="560" w:leftChars="0"/>
+      </w:pPr>
+      <w:r>
+        <w:t>摘要</w:t>
+      </w:r>
+    </w:p>
+    <w:p>
+      <w:pPr>
+        <w:bidi w:val="0"/>
+        <w:rPr>
+          <w:rFonts w:hint="eastAsia" w:eastAsia="仿宋"/>
+          <w:lang w:eastAsia="zh-CN"/>
         </w:rPr>
         <w:sectPr>
-          <w:headerReference r:id="rId3" w:type="default"/>
-          <w:footerReference r:id="rId4" w:type="default"/>
+          <w:headerReference r:id="rId5" w:type="default"/>
+          <w:footerReference r:id="rId6" w:type="default"/>
           <w:pgSz w:w="11906" w:h="16838"/>
           <w:pgMar w:top="1361" w:right="851" w:bottom="851" w:left="1418" w:header="794" w:footer="113" w:gutter="0"/>
           <w:pgNumType w:start="1"/>
@@ -45,42 +31,57 @@
           <w:docGrid w:type="lines" w:linePitch="312" w:charSpace="0"/>
         </w:sectPr>
       </w:pPr>
-    </w:p>
-    <w:p>
-      <w:pPr>
-        <w:wordWrap w:val="0"/>
-        <w:spacing w:line="440" w:lineRule="exact"/>
-        <w:rPr>
-          <w:rFonts w:hint="default" w:ascii="Times New Roman" w:hAnsi="Times New Roman" w:eastAsia="仿宋"/>
-          <w:b/>
-          <w:sz w:val="28"/>
-          <w:szCs w:val="28"/>
-          <w:lang w:val="en-US" w:eastAsia="zh-CN"/>
-        </w:rPr>
-      </w:pPr>
-      <w:r>
-        <w:rPr>
-          <w:rFonts w:hint="eastAsia" w:ascii="Times New Roman" w:hAnsi="Times New Roman" w:eastAsia="仿宋"/>
-          <w:b/>
-          <w:sz w:val="28"/>
-          <w:szCs w:val="28"/>
-          <w:lang w:val="en-US" w:eastAsia="zh-CN"/>
-        </w:rPr>
-        <w:t>摘要附图：</w:t>
-      </w:r>
-    </w:p>
-    <w:p>
-      <w:pPr>
-        <w:wordWrap w:val="0"/>
-        <w:spacing w:before="60" w:line="440" w:lineRule="exact"/>
-        <w:jc w:val="left"/>
-        <w:rPr>
-          <w:rFonts w:ascii="Times New Roman" w:hAnsi="Times New Roman" w:eastAsia="仿宋"/>
-          <w:sz w:val="28"/>
-          <w:szCs w:val="28"/>
+      <w:r>
+        <w:rPr>
+          <w:rFonts w:hint="eastAsia"/>
+          <w:lang w:eastAsia="zh-CN"/>
+        </w:rPr>
+        <w:t>【请填写摘要】</w:t>
+      </w:r>
+    </w:p>
+    <w:p>
+      <w:pPr>
+        <w:pStyle w:val="13"/>
+        <w:bidi w:val="0"/>
+        <w:rPr>
+          <w:rFonts w:hint="eastAsia"/>
+          <w:lang w:eastAsia="zh-CN"/>
+        </w:rPr>
+      </w:pPr>
+      <w:r>
+        <w:rPr>
+          <w:rFonts w:hint="eastAsia"/>
+          <w:lang w:eastAsia="zh-CN"/>
+        </w:rPr>
+        <w:t>图1【请填写摘要附图标题】</w:t>
+      </w:r>
+    </w:p>
+    <w:p>
+      <w:pPr>
+        <w:pStyle w:val="15"/>
+        <w:bidi w:val="0"/>
+        <w:rPr>
+          <w:rFonts w:hint="eastAsia"/>
+          <w:lang w:eastAsia="zh-CN"/>
+        </w:rPr>
+      </w:pPr>
+      <w:r>
+        <w:rPr>
+          <w:rFonts w:hint="eastAsia"/>
+          <w:lang w:eastAsia="zh-CN"/>
+        </w:rPr>
+        <w:t>【在此插入摘要附图】</w:t>
+      </w:r>
+    </w:p>
+    <w:p>
+      <w:pPr>
+        <w:bidi w:val="0"/>
+        <w:rPr>
+          <w:rFonts w:hint="eastAsia"/>
+          <w:lang w:eastAsia="zh-CN"/>
         </w:rPr>
         <w:sectPr>
-          <w:headerReference r:id="rId5" w:type="default"/>
+          <w:headerReference r:id="rId7" w:type="default"/>
           <w:pgSz w:w="11906" w:h="16838"/>
           <w:pgMar w:top="1361" w:right="851" w:bottom="851" w:left="1418" w:header="794" w:footer="113" w:gutter="0"/>
           <w:pgNumType w:start="1"/>
@@ -91,40 +92,34 @@
     </w:p>
     <w:p>
       <w:pPr>
-        <w:wordWrap w:val="0"/>
-        <w:spacing w:line="440" w:lineRule="exact"/>
-        <w:rPr>
-          <w:rFonts w:hint="default" w:ascii="Times New Roman" w:hAnsi="Times New Roman" w:eastAsia="仿宋"/>
-          <w:b/>
-          <w:sz w:val="28"/>
-          <w:szCs w:val="28"/>
-          <w:lang w:val="en-US" w:eastAsia="zh-CN"/>
-        </w:rPr>
-      </w:pPr>
-      <w:r>
-        <w:rPr>
-          <w:rFonts w:hint="eastAsia" w:ascii="Times New Roman" w:hAnsi="Times New Roman" w:eastAsia="仿宋"/>
-          <w:b/>
-          <w:sz w:val="28"/>
-          <w:szCs w:val="28"/>
-          <w:lang w:val="en-US" w:eastAsia="zh-CN"/>
-        </w:rPr>
-        <w:t>权利要求书：</w:t>
-      </w:r>
-    </w:p>
-    <w:p>
-      <w:pPr>
-        <w:spacing w:line="440" w:lineRule="exact"/>
-        <w:ind w:firstLine="560" w:firstLineChars="200"/>
-        <w:rPr>
-          <w:rFonts w:ascii="Times New Roman" w:hAnsi="Times New Roman" w:eastAsia="仿宋"/>
-          <w:bCs/>
-          <w:sz w:val="28"/>
-          <w:szCs w:val="28"/>
-          <w:lang w:val="en-US" w:eastAsia="zh-CN" w:bidi="ar"/>
-        </w:rPr>
+        <w:pStyle w:val="2"/>
+        <w:numPr>
+          <w:numId w:val="0"/>
+        </w:numPr>
+        <w:ind w:left="560" w:leftChars="0"/>
+      </w:pPr>
+      <w:r>
+        <w:t>权利要求书</w:t>
+      </w:r>
+    </w:p>
+    <w:p>
+      <w:pPr>
+        <w:pStyle w:val="12"/>
+        <w:bidi w:val="0"/>
+        <w:rPr>
+          <w:rFonts w:hint="eastAsia"/>
+          <w:lang w:val="en-US" w:eastAsia="zh-CN"/>
+        </w:rPr>
+      </w:pPr>
+      <w:r>
+        <w:t>【请填写权利要求书】</w:t>
+      </w:r>
+    </w:p>
+    <w:p>
+      <w:pPr>
+        <w:bidi w:val="0"/>
         <w:sectPr>
-          <w:headerReference r:id="rId6" w:type="default"/>
+          <w:headerReference r:id="rId8" w:type="default"/>
           <w:pgSz w:w="11906" w:h="16838"/>
           <w:pgMar w:top="1361" w:right="851" w:bottom="851" w:left="1418" w:header="794" w:footer="113" w:gutter="0"/>
           <w:pgNumType w:start="1"/>
@@ -135,179 +130,576 @@
     </w:p>
     <w:p>
       <w:pPr>
-        <w:wordWrap w:val="0"/>
-        <w:spacing w:line="440" w:lineRule="exact"/>
-        <w:jc w:val="center"/>
-        <w:rPr>
-          <w:rFonts w:hint="default" w:ascii="Times New Roman" w:hAnsi="Times New Roman" w:eastAsia="仿宋"/>
-          <w:sz w:val="28"/>
-          <w:szCs w:val="28"/>
-          <w:lang w:val="en-US" w:eastAsia="zh-CN"/>
-        </w:rPr>
-      </w:pPr>
-      <w:r>
-        <w:rPr>
-          <w:rFonts w:hint="eastAsia" w:ascii="Times New Roman" w:hAnsi="Times New Roman" w:eastAsia="仿宋"/>
-          <w:sz w:val="28"/>
-          <w:szCs w:val="28"/>
-          <w:lang w:val="en-US" w:eastAsia="zh-CN"/>
-        </w:rPr>
-        <w:t>标题</w:t>
-      </w:r>
-    </w:p>
-    <w:p>
-      <w:pPr>
-        <w:wordWrap w:val="0"/>
-        <w:spacing w:line="440" w:lineRule="exact"/>
-        <w:rPr>
-          <w:rFonts w:ascii="Times New Roman" w:hAnsi="Times New Roman" w:eastAsia="仿宋"/>
-          <w:b/>
-          <w:sz w:val="28"/>
-          <w:szCs w:val="28"/>
-        </w:rPr>
-      </w:pPr>
-      <w:r>
-        <w:rPr>
-          <w:rFonts w:ascii="Times New Roman" w:hAnsi="Times New Roman" w:eastAsia="仿宋"/>
-          <w:b/>
-          <w:sz w:val="28"/>
-          <w:szCs w:val="28"/>
+        <w:pStyle w:val="7"/>
+        <w:bidi w:val="0"/>
+        <w:rPr>
+          <w:rFonts w:hint="eastAsia"/>
+          <w:lang w:eastAsia="zh-CN"/>
+        </w:rPr>
+      </w:pPr>
+      <w:r>
+        <w:rPr>
+          <w:rFonts w:hint="eastAsia"/>
+          <w:lang w:eastAsia="zh-CN"/>
+        </w:rPr>
+        <w:t>【请填写发明名称】</w:t>
+      </w:r>
+    </w:p>
+    <w:p>
+      <w:pPr>
+        <w:pStyle w:val="2"/>
+        <w:numPr>
+          <w:numId w:val="0"/>
+        </w:numPr>
+        <w:bidi w:val="0"/>
+        <w:ind w:left="560" w:leftChars="0"/>
+        <w:rPr>
+          <w:rFonts w:hint="eastAsia"/>
+          <w:lang w:eastAsia="zh-CN"/>
+        </w:rPr>
+      </w:pPr>
+      <w:r>
+        <w:rPr>
+          <w:rFonts w:hint="eastAsia"/>
+          <w:lang w:eastAsia="zh-CN"/>
         </w:rPr>
         <w:t>技术领域</w:t>
       </w:r>
     </w:p>
     <w:p>
       <w:pPr>
-        <w:wordWrap w:val="0"/>
-        <w:spacing w:line="440" w:lineRule="exact"/>
-        <w:rPr>
-          <w:rFonts w:hint="eastAsia" w:ascii="Times New Roman" w:hAnsi="Times New Roman" w:eastAsia="仿宋"/>
-          <w:sz w:val="28"/>
-          <w:szCs w:val="28"/>
-        </w:rPr>
-      </w:pPr>
-      <w:r>
-        <w:rPr>
-          <w:rFonts w:ascii="Times New Roman" w:hAnsi="Times New Roman" w:eastAsia="仿宋"/>
-          <w:b/>
-          <w:sz w:val="28"/>
-          <w:szCs w:val="28"/>
+        <w:bidi w:val="0"/>
+        <w:rPr>
+          <w:rFonts w:hint="eastAsia"/>
+          <w:lang w:eastAsia="zh-CN"/>
+        </w:rPr>
+      </w:pPr>
+      <w:r>
+        <w:rPr>
+          <w:rFonts w:hint="eastAsia"/>
+          <w:lang w:eastAsia="zh-CN"/>
+        </w:rPr>
+        <w:t>【请填写技术领域内容】</w:t>
+      </w:r>
+    </w:p>
+    <w:p>
+      <w:pPr>
+        <w:pStyle w:val="2"/>
+        <w:numPr>
+          <w:numId w:val="0"/>
+        </w:numPr>
+        <w:bidi w:val="0"/>
+        <w:ind w:left="560" w:leftChars="0"/>
+        <w:rPr>
+          <w:rFonts w:hint="eastAsia"/>
+          <w:lang w:eastAsia="zh-CN"/>
+        </w:rPr>
+      </w:pPr>
+      <w:r>
+        <w:rPr>
+          <w:rFonts w:hint="eastAsia"/>
+          <w:lang w:eastAsia="zh-CN"/>
         </w:rPr>
         <w:t>技术背景</w:t>
       </w:r>
+    </w:p>
+    <w:p>
+      <w:pPr>
+        <w:bidi w:val="0"/>
+        <w:rPr>
+          <w:rFonts w:hint="eastAsia"/>
+          <w:lang w:eastAsia="zh-CN"/>
+        </w:rPr>
+      </w:pPr>
+      <w:r>
+        <w:rPr>
+          <w:rFonts w:hint="eastAsia"/>
+          <w:lang w:val="en-US" w:eastAsia="zh-CN"/>
+        </w:rPr>
+        <w:t>【请填写技术背景内容】</w:t>
+      </w:r>
+    </w:p>
+    <w:p>
+      <w:pPr>
+        <w:pStyle w:val="2"/>
+        <w:numPr>
+          <w:numId w:val="0"/>
+        </w:numPr>
+        <w:bidi w:val="0"/>
+        <w:ind w:left="560" w:leftChars="0"/>
+        <w:rPr>
+          <w:rFonts w:hint="eastAsia"/>
+          <w:lang w:eastAsia="zh-CN"/>
+        </w:rPr>
+      </w:pPr>
+      <w:r>
+        <w:rPr>
+          <w:rFonts w:hint="eastAsia"/>
+          <w:lang w:eastAsia="zh-CN"/>
+        </w:rPr>
+        <w:t>发明内容</w:t>
+      </w:r>
+    </w:p>
+    <w:p>
+      <w:pPr>
+        <w:bidi w:val="0"/>
+        <w:rPr>
+          <w:rFonts w:hint="eastAsia"/>
+          <w:lang w:eastAsia="zh-CN"/>
+        </w:rPr>
+      </w:pPr>
+      <w:r>
+        <w:rPr>
+          <w:rFonts w:hint="eastAsia"/>
+          <w:lang w:eastAsia="zh-CN"/>
+        </w:rPr>
+        <w:t>【请填写发明目的】</w:t>
+      </w:r>
+    </w:p>
+    <w:p>
+      <w:pPr>
+        <w:bidi w:val="0"/>
+        <w:rPr>
+          <w:rFonts w:hint="eastAsia"/>
+          <w:lang w:eastAsia="zh-CN"/>
+        </w:rPr>
+      </w:pPr>
+      <w:r>
+        <w:rPr>
+          <w:rFonts w:hint="eastAsia"/>
+          <w:lang w:eastAsia="zh-CN"/>
+        </w:rPr>
+        <w:t>【请填写技术方案总体说明】</w:t>
+      </w:r>
+    </w:p>
+    <w:p>
+      <w:pPr>
+        <w:bidi w:val="0"/>
+        <w:rPr>
+          <w:rFonts w:hint="eastAsia"/>
+          <w:lang w:val="en-US" w:eastAsia="zh-CN"/>
+        </w:rPr>
+      </w:pPr>
+      <w:r>
+        <w:rPr>
+          <w:rFonts w:hint="eastAsia"/>
+          <w:lang w:val="en-US" w:eastAsia="zh-CN"/>
+        </w:rPr>
+        <w:t>【请填写技术方案的核心结构、步骤或模块】</w:t>
+      </w:r>
+    </w:p>
+    <w:p>
+      <w:pPr>
+        <w:bidi w:val="0"/>
+        <w:rPr>
+          <w:rFonts w:hint="eastAsia"/>
+          <w:lang w:eastAsia="zh-CN"/>
+        </w:rPr>
+      </w:pPr>
+      <w:r>
+        <w:rPr>
+          <w:rFonts w:hint="eastAsia"/>
+          <w:lang w:eastAsia="zh-CN"/>
+        </w:rPr>
+        <w:t>【请填写有益效果】</w:t>
+      </w:r>
+    </w:p>
+    <w:p>
+      <w:pPr>
+        <w:pStyle w:val="2"/>
+        <w:numPr>
+          <w:numId w:val="0"/>
+        </w:numPr>
+        <w:bidi w:val="0"/>
+        <w:ind w:left="560" w:leftChars="0"/>
+        <w:rPr>
+          <w:rFonts w:hint="eastAsia"/>
+          <w:lang w:eastAsia="zh-CN"/>
+        </w:rPr>
+      </w:pPr>
+      <w:r>
+        <w:rPr>
+          <w:rFonts w:hint="eastAsia"/>
+          <w:lang w:eastAsia="zh-CN"/>
+        </w:rPr>
+        <w:t>附图说明</w:t>
+      </w:r>
+    </w:p>
+    <w:p>
+      <w:pPr>
+        <w:bidi w:val="0"/>
+        <w:rPr>
+          <w:rFonts w:hint="eastAsia"/>
+          <w:lang w:eastAsia="zh-CN"/>
+        </w:rPr>
+      </w:pPr>
+      <w:r>
+        <w:rPr>
+          <w:rFonts w:hint="eastAsia"/>
+          <w:lang w:eastAsia="zh-CN"/>
+        </w:rPr>
+        <w:t>图1【请填写附图说明】；</w:t>
+      </w:r>
+    </w:p>
+    <w:p>
+      <w:pPr>
+        <w:bidi w:val="0"/>
+        <w:rPr>
+          <w:rFonts w:hint="eastAsia"/>
+          <w:lang w:eastAsia="zh-CN"/>
+        </w:rPr>
+      </w:pPr>
+      <w:r>
+        <w:rPr>
+          <w:rFonts w:hint="eastAsia"/>
+          <w:lang w:eastAsia="zh-CN"/>
+        </w:rPr>
+        <w:t>图2【请填写附图说明】；</w:t>
+      </w:r>
+    </w:p>
+    <w:p>
+      <w:pPr>
+        <w:bidi w:val="0"/>
+        <w:rPr>
+          <w:rFonts w:hint="eastAsia"/>
+          <w:lang w:eastAsia="zh-CN"/>
+        </w:rPr>
+      </w:pPr>
+      <w:r>
+        <w:rPr>
+          <w:rFonts w:hint="eastAsia"/>
+          <w:lang w:eastAsia="zh-CN"/>
+        </w:rPr>
+        <w:t>图3【请填写附图说明】；</w:t>
+      </w:r>
+    </w:p>
+    <w:p>
+      <w:pPr>
+        <w:bidi w:val="0"/>
+        <w:rPr>
+          <w:rFonts w:hint="eastAsia"/>
+          <w:lang w:eastAsia="zh-CN"/>
+        </w:rPr>
+      </w:pPr>
+      <w:r>
+        <w:rPr>
+          <w:rFonts w:hint="eastAsia"/>
+          <w:lang w:eastAsia="zh-CN"/>
+        </w:rPr>
+        <w:t>图4【请填写附图说明】；</w:t>
+      </w:r>
+    </w:p>
+    <w:p>
+      <w:pPr>
+        <w:bidi w:val="0"/>
+        <w:rPr>
+          <w:rFonts w:hint="eastAsia"/>
+          <w:lang w:eastAsia="zh-CN"/>
+        </w:rPr>
+      </w:pPr>
+      <w:r>
+        <w:rPr>
+          <w:rFonts w:hint="eastAsia"/>
+          <w:lang w:eastAsia="zh-CN"/>
+        </w:rPr>
+        <w:t>图5【请填写附图说明】；</w:t>
+      </w:r>
+    </w:p>
+    <w:p>
+      <w:pPr>
+        <w:bidi w:val="0"/>
+        <w:rPr>
+          <w:rFonts w:hint="eastAsia"/>
+          <w:lang w:eastAsia="zh-CN"/>
+        </w:rPr>
+      </w:pPr>
+      <w:r>
+        <w:rPr>
+          <w:rFonts w:hint="eastAsia"/>
+          <w:lang w:eastAsia="zh-CN"/>
+        </w:rPr>
+        <w:t>图6【请填写附图说明】；</w:t>
+      </w:r>
+    </w:p>
+    <w:p>
+      <w:pPr>
+        <w:bidi w:val="0"/>
+        <w:rPr>
+          <w:rFonts w:hint="eastAsia"/>
+          <w:lang w:eastAsia="zh-CN"/>
+        </w:rPr>
+      </w:pPr>
+      <w:r>
+        <w:rPr>
+          <w:rFonts w:hint="eastAsia"/>
+          <w:lang w:eastAsia="zh-CN"/>
+        </w:rPr>
+        <w:t>图7【请填写附图说明】。</w:t>
+      </w:r>
+    </w:p>
+    <w:p>
+      <w:pPr>
+        <w:pStyle w:val="2"/>
+        <w:numPr>
+          <w:numId w:val="0"/>
+        </w:numPr>
+        <w:bidi w:val="0"/>
+        <w:ind w:left="560" w:leftChars="0"/>
+        <w:rPr>
+          <w:rFonts w:hint="eastAsia"/>
+          <w:lang w:eastAsia="zh-CN"/>
+        </w:rPr>
+      </w:pPr>
       <w:bookmarkStart w:id="0" w:name="_GoBack"/>
       <w:bookmarkEnd w:id="0"/>
-    </w:p>
-    <w:p>
-      <w:pPr>
-        <w:wordWrap w:val="0"/>
-        <w:spacing w:line="440" w:lineRule="exact"/>
-        <w:jc w:val="left"/>
-        <w:rPr>
-          <w:rFonts w:ascii="Times New Roman" w:hAnsi="Times New Roman" w:eastAsia="仿宋"/>
-          <w:b/>
-          <w:sz w:val="28"/>
-          <w:szCs w:val="28"/>
-        </w:rPr>
-      </w:pPr>
-      <w:r>
-        <w:rPr>
-          <w:rFonts w:hint="eastAsia" w:ascii="Times New Roman" w:hAnsi="Times New Roman" w:eastAsia="仿宋"/>
-          <w:b/>
-          <w:sz w:val="28"/>
-          <w:szCs w:val="28"/>
-        </w:rPr>
-        <w:t>发明</w:t>
-      </w:r>
-      <w:r>
-        <w:rPr>
-          <w:rFonts w:ascii="Times New Roman" w:hAnsi="Times New Roman" w:eastAsia="仿宋"/>
-          <w:b/>
-          <w:sz w:val="28"/>
-          <w:szCs w:val="28"/>
-        </w:rPr>
-        <w:t>内容</w:t>
-      </w:r>
-    </w:p>
-    <w:p>
-      <w:pPr>
-        <w:wordWrap w:val="0"/>
-        <w:spacing w:line="440" w:lineRule="exact"/>
-        <w:rPr>
-          <w:rFonts w:ascii="Times New Roman" w:hAnsi="Times New Roman" w:eastAsia="仿宋"/>
-          <w:b/>
-          <w:sz w:val="28"/>
-          <w:szCs w:val="28"/>
-        </w:rPr>
-      </w:pPr>
-      <w:r>
-        <w:rPr>
-          <w:rFonts w:ascii="Times New Roman" w:hAnsi="Times New Roman" w:eastAsia="仿宋"/>
-          <w:b/>
-          <w:sz w:val="28"/>
-          <w:szCs w:val="28"/>
-        </w:rPr>
-        <w:t>附图说明</w:t>
-      </w:r>
-    </w:p>
-    <w:p>
-      <w:pPr>
-        <w:wordWrap w:val="0"/>
-        <w:spacing w:line="440" w:lineRule="exact"/>
-        <w:rPr>
-          <w:rFonts w:ascii="Times New Roman" w:hAnsi="Times New Roman" w:eastAsia="仿宋"/>
-          <w:b/>
-          <w:sz w:val="28"/>
-          <w:szCs w:val="28"/>
-        </w:rPr>
-      </w:pPr>
-      <w:r>
-        <w:rPr>
-          <w:rFonts w:ascii="Times New Roman" w:hAnsi="Times New Roman" w:eastAsia="仿宋"/>
-          <w:b/>
-          <w:sz w:val="28"/>
-          <w:szCs w:val="28"/>
+      <w:r>
+        <w:rPr>
+          <w:rFonts w:hint="eastAsia"/>
+          <w:lang w:eastAsia="zh-CN"/>
         </w:rPr>
         <w:t>具体实施方式</w:t>
       </w:r>
     </w:p>
     <w:p>
       <w:pPr>
-        <w:wordWrap w:val="0"/>
-        <w:spacing w:line="440" w:lineRule="exact"/>
-        <w:ind w:firstLine="560" w:firstLineChars="200"/>
-        <w:rPr>
-          <w:rFonts w:ascii="Times New Roman" w:hAnsi="Times New Roman" w:eastAsia="仿宋"/>
-          <w:sz w:val="28"/>
-          <w:szCs w:val="28"/>
-        </w:rPr>
-      </w:pPr>
-    </w:p>
-    <w:p>
-      <w:pPr>
-        <w:wordWrap w:val="0"/>
-        <w:spacing w:line="440" w:lineRule="exact"/>
-        <w:ind w:firstLine="560" w:firstLineChars="200"/>
-        <w:rPr>
-          <w:rFonts w:ascii="Times New Roman" w:hAnsi="Times New Roman" w:eastAsia="仿宋"/>
-          <w:sz w:val="28"/>
-          <w:szCs w:val="28"/>
-        </w:rPr>
-      </w:pPr>
-    </w:p>
-    <w:p>
-      <w:pPr>
-        <w:wordWrap w:val="0"/>
-        <w:spacing w:line="440" w:lineRule="exact"/>
-        <w:ind w:firstLine="560" w:firstLineChars="200"/>
-        <w:rPr>
-          <w:rFonts w:ascii="Times New Roman" w:hAnsi="Times New Roman" w:eastAsia="仿宋"/>
-          <w:sz w:val="28"/>
-          <w:szCs w:val="28"/>
+        <w:bidi w:val="0"/>
+        <w:rPr>
+          <w:rFonts w:hint="eastAsia"/>
+          <w:lang w:val="en-US" w:eastAsia="zh-CN"/>
+        </w:rPr>
+      </w:pPr>
+      <w:r>
+        <w:rPr>
+          <w:rFonts w:hint="eastAsia"/>
+          <w:lang w:val="en-US" w:eastAsia="zh-CN"/>
+        </w:rPr>
+        <w:t>【请结合附图填写具体实施方式总述】</w:t>
+      </w:r>
+    </w:p>
+    <w:p>
+      <w:pPr>
+        <w:pStyle w:val="3"/>
+        <w:bidi w:val="0"/>
+        <w:rPr>
+          <w:rFonts w:hint="eastAsia"/>
+          <w:lang w:val="en-US" w:eastAsia="zh-CN"/>
+        </w:rPr>
+      </w:pPr>
+      <w:r>
+        <w:rPr>
+          <w:rFonts w:hint="eastAsia"/>
+          <w:lang w:val="en-US" w:eastAsia="zh-CN"/>
+        </w:rPr>
+        <w:t>步骤一：</w:t>
+      </w:r>
+    </w:p>
+    <w:p>
+      <w:pPr>
+        <w:bidi w:val="0"/>
+        <w:rPr>
+          <w:rFonts w:hint="eastAsia"/>
+          <w:lang w:val="en-US" w:eastAsia="zh-CN"/>
+        </w:rPr>
+      </w:pPr>
+      <w:r>
+        <w:rPr>
+          <w:rFonts w:hint="eastAsia"/>
+          <w:lang w:val="en-US" w:eastAsia="zh-CN"/>
+        </w:rPr>
+        <w:t>【请填写步骤一的实施内容】</w:t>
+      </w:r>
+    </w:p>
+    <w:p>
+      <w:pPr>
+        <w:pStyle w:val="3"/>
+        <w:bidi w:val="0"/>
+        <w:rPr>
+          <w:rFonts w:hint="eastAsia"/>
+          <w:lang w:val="en-US" w:eastAsia="zh-CN"/>
+        </w:rPr>
+      </w:pPr>
+      <w:r>
+        <w:rPr>
+          <w:rFonts w:hint="eastAsia"/>
+          <w:lang w:val="en-US" w:eastAsia="zh-CN"/>
+        </w:rPr>
+        <w:t>步骤二：</w:t>
+      </w:r>
+    </w:p>
+    <w:p>
+      <w:pPr>
+        <w:bidi w:val="0"/>
+        <w:rPr>
+          <w:rFonts w:hint="eastAsia"/>
+          <w:lang w:val="en-US" w:eastAsia="zh-CN"/>
+        </w:rPr>
+      </w:pPr>
+      <w:r>
+        <w:rPr>
+          <w:rFonts w:hint="eastAsia"/>
+          <w:lang w:val="en-US" w:eastAsia="zh-CN"/>
+        </w:rPr>
+        <w:t>【请填写步骤二的实施内容】</w:t>
+      </w:r>
+    </w:p>
+    <w:p>
+      <w:pPr>
+        <w:pStyle w:val="3"/>
+        <w:bidi w:val="0"/>
+        <w:rPr>
+          <w:rFonts w:hint="eastAsia"/>
+          <w:lang w:val="en-US" w:eastAsia="zh-CN"/>
+        </w:rPr>
+      </w:pPr>
+      <w:r>
+        <w:rPr>
+          <w:rFonts w:hint="eastAsia"/>
+          <w:lang w:val="en-US" w:eastAsia="zh-CN"/>
+        </w:rPr>
+        <w:t>步骤三：</w:t>
+      </w:r>
+    </w:p>
+    <w:p>
+      <w:pPr>
+        <w:bidi w:val="0"/>
+        <w:rPr>
+          <w:rFonts w:hint="eastAsia"/>
+          <w:lang w:val="en-US" w:eastAsia="zh-CN"/>
+        </w:rPr>
+      </w:pPr>
+      <w:r>
+        <w:rPr>
+          <w:rFonts w:hint="eastAsia"/>
+          <w:lang w:val="en-US" w:eastAsia="zh-CN"/>
+        </w:rPr>
+        <w:t>【请填写步骤三的实施内容】</w:t>
+      </w:r>
+    </w:p>
+    <w:p>
+      <w:pPr>
+        <w:pStyle w:val="3"/>
+        <w:bidi w:val="0"/>
+        <w:rPr>
+          <w:rFonts w:hint="eastAsia"/>
+          <w:lang w:val="en-US" w:eastAsia="zh-CN"/>
+        </w:rPr>
+      </w:pPr>
+      <w:r>
+        <w:rPr>
+          <w:rFonts w:hint="eastAsia"/>
+          <w:lang w:val="en-US" w:eastAsia="zh-CN"/>
+        </w:rPr>
+        <w:t>步骤四：</w:t>
+      </w:r>
+    </w:p>
+    <w:p>
+      <w:pPr>
+        <w:bidi w:val="0"/>
+        <w:rPr>
+          <w:rFonts w:hint="eastAsia"/>
+          <w:lang w:val="en-US" w:eastAsia="zh-CN"/>
+        </w:rPr>
+      </w:pPr>
+      <w:r>
+        <w:rPr>
+          <w:rFonts w:hint="eastAsia"/>
+          <w:lang w:val="en-US" w:eastAsia="zh-CN"/>
+        </w:rPr>
+        <w:t>【请填写步骤四的实施内容】</w:t>
+      </w:r>
+    </w:p>
+    <w:p>
+      <w:pPr>
+        <w:pStyle w:val="3"/>
+        <w:bidi w:val="0"/>
+        <w:rPr>
+          <w:rFonts w:hint="eastAsia"/>
+          <w:lang w:val="en-US" w:eastAsia="zh-CN"/>
+        </w:rPr>
+      </w:pPr>
+      <w:r>
+        <w:rPr>
+          <w:rFonts w:hint="eastAsia"/>
+          <w:lang w:val="en-US" w:eastAsia="zh-CN"/>
+        </w:rPr>
+        <w:t>步骤五：</w:t>
+      </w:r>
+    </w:p>
+    <w:p>
+      <w:pPr>
+        <w:bidi w:val="0"/>
+        <w:rPr>
+          <w:rFonts w:hint="eastAsia"/>
+          <w:lang w:val="en-US" w:eastAsia="zh-CN"/>
+        </w:rPr>
+      </w:pPr>
+      <w:r>
+        <w:rPr>
+          <w:rFonts w:hint="eastAsia"/>
+          <w:lang w:val="en-US" w:eastAsia="zh-CN"/>
+        </w:rPr>
+        <w:t>【请填写步骤五的实施内容】</w:t>
+      </w:r>
+    </w:p>
+    <w:p>
+      <w:pPr>
+        <w:pStyle w:val="3"/>
+        <w:bidi w:val="0"/>
+        <w:rPr>
+          <w:rFonts w:hint="eastAsia"/>
+          <w:lang w:val="en-US" w:eastAsia="zh-CN"/>
+        </w:rPr>
+      </w:pPr>
+      <w:r>
+        <w:rPr>
+          <w:rFonts w:hint="eastAsia"/>
+          <w:lang w:val="en-US" w:eastAsia="zh-CN"/>
+        </w:rPr>
+        <w:t>步骤六：</w:t>
+      </w:r>
+    </w:p>
+    <w:p>
+      <w:pPr>
+        <w:bidi w:val="0"/>
+        <w:rPr>
+          <w:rFonts w:hint="eastAsia"/>
+          <w:lang w:val="en-US" w:eastAsia="zh-CN"/>
+        </w:rPr>
+      </w:pPr>
+      <w:r>
+        <w:rPr>
+          <w:rFonts w:hint="eastAsia"/>
+          <w:lang w:val="en-US" w:eastAsia="zh-CN"/>
+        </w:rPr>
+        <w:t>【请填写步骤六的实施内容】</w:t>
+      </w:r>
+    </w:p>
+    <w:p>
+      <w:pPr>
+        <w:bidi w:val="0"/>
+        <w:rPr>
+          <w:rFonts w:hint="eastAsia"/>
+          <w:lang w:val="en-US" w:eastAsia="zh-CN"/>
+        </w:rPr>
+      </w:pPr>
+      <w:r>
+        <w:rPr>
+          <w:rFonts w:hint="eastAsia"/>
+          <w:lang w:val="en-US" w:eastAsia="zh-CN"/>
+        </w:rPr>
+        <w:t>以上所述仅为本模板的结构示例，具体实施内容请根据实际方案进行撰写。</w:t>
+      </w:r>
+    </w:p>
+    <w:p>
+      <w:pPr>
+        <w:bidi w:val="0"/>
+        <w:rPr>
+          <w:rFonts w:hint="eastAsia"/>
+          <w:lang w:val="en-US" w:eastAsia="zh-CN"/>
         </w:rPr>
         <w:sectPr>
-          <w:headerReference r:id="rId7" w:type="default"/>
-          <w:footerReference r:id="rId8" w:type="default"/>
+          <w:headerReference r:id="rId9" w:type="default"/>
+          <w:footerReference r:id="rId10" w:type="default"/>
           <w:pgSz w:w="11906" w:h="16838"/>
           <w:pgMar w:top="1418" w:right="851" w:bottom="851" w:left="1418" w:header="851" w:footer="113" w:gutter="0"/>
           <w:pgNumType w:start="1"/>
@@ -318,216 +710,220 @@
     </w:p>
     <w:p>
       <w:pPr>
-        <w:jc w:val="center"/>
-        <w:rPr>
-          <w:rFonts w:hint="eastAsia" w:ascii="Times New Roman" w:hAnsi="Times New Roman" w:eastAsia="仿宋"/>
-          <w:sz w:val="28"/>
-          <w:szCs w:val="28"/>
-          <w:lang w:eastAsia="zh-CN"/>
-        </w:rPr>
-      </w:pPr>
-    </w:p>
-    <w:p>
-      <w:pPr>
-        <w:jc w:val="center"/>
-        <w:rPr>
-          <w:rFonts w:ascii="Times New Roman" w:hAnsi="Times New Roman" w:eastAsia="仿宋"/>
-          <w:sz w:val="28"/>
-          <w:szCs w:val="28"/>
-        </w:rPr>
-      </w:pPr>
-      <w:r>
-        <w:rPr>
-          <w:rFonts w:ascii="Times New Roman" w:hAnsi="Times New Roman" w:eastAsia="仿宋"/>
-          <w:sz w:val="28"/>
-          <w:szCs w:val="28"/>
+        <w:pStyle w:val="14"/>
+        <w:bidi w:val="0"/>
+        <w:rPr>
+          <w:rFonts w:hint="eastAsia"/>
+          <w:lang w:eastAsia="zh-CN"/>
+        </w:rPr>
+      </w:pPr>
+      <w:r>
+        <w:rPr>
+          <w:rFonts w:hint="eastAsia"/>
+          <w:lang w:eastAsia="zh-CN"/>
         </w:rPr>
         <w:t>图1</w:t>
       </w:r>
     </w:p>
     <w:p>
       <w:pPr>
-        <w:jc w:val="center"/>
-        <w:rPr>
-          <w:rFonts w:hint="eastAsia" w:ascii="Times New Roman" w:hAnsi="Times New Roman" w:eastAsia="仿宋"/>
-          <w:sz w:val="28"/>
-          <w:szCs w:val="28"/>
-          <w:lang w:eastAsia="zh-CN"/>
-        </w:rPr>
-      </w:pPr>
-    </w:p>
-    <w:p>
-      <w:pPr>
-        <w:wordWrap w:val="0"/>
-        <w:jc w:val="center"/>
-        <w:rPr>
-          <w:rFonts w:ascii="Times New Roman" w:hAnsi="Times New Roman" w:eastAsia="仿宋"/>
-          <w:sz w:val="28"/>
-          <w:szCs w:val="28"/>
-        </w:rPr>
-      </w:pPr>
-      <w:r>
-        <w:rPr>
-          <w:rFonts w:ascii="Times New Roman" w:hAnsi="Times New Roman" w:eastAsia="仿宋"/>
-          <w:sz w:val="28"/>
-          <w:szCs w:val="28"/>
+        <w:pStyle w:val="15"/>
+        <w:bidi w:val="0"/>
+        <w:rPr>
+          <w:rFonts w:hint="eastAsia"/>
+          <w:lang w:eastAsia="zh-CN"/>
+        </w:rPr>
+      </w:pPr>
+      <w:r>
+        <w:rPr>
+          <w:rFonts w:hint="eastAsia"/>
+          <w:lang w:eastAsia="zh-CN"/>
+        </w:rPr>
+        <w:t>【在此插入图1】</w:t>
+      </w:r>
+    </w:p>
+    <w:p>
+      <w:pPr>
+        <w:pStyle w:val="14"/>
+        <w:bidi w:val="0"/>
+        <w:rPr>
+          <w:rFonts w:hint="eastAsia"/>
+          <w:lang w:eastAsia="zh-CN"/>
+        </w:rPr>
+      </w:pPr>
+      <w:r>
+        <w:rPr>
+          <w:rFonts w:hint="eastAsia"/>
+          <w:lang w:eastAsia="zh-CN"/>
         </w:rPr>
         <w:t>图2</w:t>
       </w:r>
     </w:p>
     <w:p>
       <w:pPr>
-        <w:wordWrap w:val="0"/>
-        <w:jc w:val="center"/>
-        <w:rPr>
-          <w:rFonts w:hint="eastAsia" w:ascii="Times New Roman" w:hAnsi="Times New Roman" w:eastAsia="仿宋"/>
-          <w:sz w:val="28"/>
-          <w:szCs w:val="28"/>
-          <w:lang w:eastAsia="zh-CN"/>
-        </w:rPr>
-      </w:pPr>
-    </w:p>
-    <w:p>
-      <w:pPr>
-        <w:wordWrap w:val="0"/>
-        <w:jc w:val="center"/>
-        <w:rPr>
-          <w:rFonts w:hint="eastAsia" w:ascii="Times New Roman" w:hAnsi="Times New Roman" w:eastAsia="仿宋"/>
-          <w:sz w:val="28"/>
-          <w:szCs w:val="28"/>
-        </w:rPr>
-      </w:pPr>
-      <w:r>
-        <w:rPr>
-          <w:rFonts w:ascii="Times New Roman" w:hAnsi="Times New Roman" w:eastAsia="仿宋"/>
-          <w:sz w:val="28"/>
-          <w:szCs w:val="28"/>
+        <w:pStyle w:val="15"/>
+        <w:bidi w:val="0"/>
+        <w:rPr>
+          <w:rFonts w:hint="eastAsia"/>
+          <w:lang w:eastAsia="zh-CN"/>
+        </w:rPr>
+      </w:pPr>
+      <w:r>
+        <w:rPr>
+          <w:rFonts w:hint="eastAsia"/>
+          <w:lang w:eastAsia="zh-CN"/>
+        </w:rPr>
+        <w:t>【在此插入图2】</w:t>
+      </w:r>
+    </w:p>
+    <w:p>
+      <w:pPr>
+        <w:pStyle w:val="14"/>
+        <w:bidi w:val="0"/>
+        <w:rPr>
+          <w:rFonts w:hint="eastAsia"/>
+          <w:lang w:eastAsia="zh-CN"/>
+        </w:rPr>
+      </w:pPr>
+      <w:r>
+        <w:rPr>
+          <w:rFonts w:hint="eastAsia"/>
+          <w:lang w:eastAsia="zh-CN"/>
         </w:rPr>
         <w:t>图3</w:t>
       </w:r>
     </w:p>
     <w:p>
       <w:pPr>
-        <w:wordWrap w:val="0"/>
-        <w:jc w:val="center"/>
-        <w:rPr>
-          <w:rFonts w:hint="eastAsia" w:ascii="Times New Roman" w:hAnsi="Times New Roman" w:eastAsia="仿宋"/>
-          <w:sz w:val="28"/>
-          <w:szCs w:val="28"/>
-          <w:lang w:eastAsia="zh-CN"/>
-        </w:rPr>
-      </w:pPr>
-    </w:p>
-    <w:p>
-      <w:pPr>
-        <w:wordWrap w:val="0"/>
-        <w:jc w:val="center"/>
-        <w:rPr>
-          <w:rFonts w:ascii="Times New Roman" w:hAnsi="Times New Roman" w:eastAsia="仿宋"/>
-          <w:sz w:val="28"/>
-          <w:szCs w:val="28"/>
-        </w:rPr>
-      </w:pPr>
-      <w:r>
-        <w:rPr>
-          <w:rFonts w:ascii="Times New Roman" w:hAnsi="Times New Roman" w:eastAsia="仿宋"/>
-          <w:sz w:val="28"/>
-          <w:szCs w:val="28"/>
+        <w:pStyle w:val="15"/>
+        <w:bidi w:val="0"/>
+        <w:rPr>
+          <w:rFonts w:hint="eastAsia"/>
+          <w:lang w:eastAsia="zh-CN"/>
+        </w:rPr>
+      </w:pPr>
+      <w:r>
+        <w:rPr>
+          <w:rFonts w:hint="eastAsia"/>
+          <w:lang w:eastAsia="zh-CN"/>
+        </w:rPr>
+        <w:t>【在此插入图3】</w:t>
+      </w:r>
+    </w:p>
+    <w:p>
+      <w:pPr>
+        <w:pStyle w:val="14"/>
+        <w:bidi w:val="0"/>
+        <w:rPr>
+          <w:rFonts w:hint="eastAsia"/>
+          <w:lang w:eastAsia="zh-CN"/>
+        </w:rPr>
+      </w:pPr>
+      <w:r>
+        <w:rPr>
+          <w:rFonts w:hint="eastAsia"/>
+          <w:lang w:eastAsia="zh-CN"/>
         </w:rPr>
         <w:t>图4</w:t>
       </w:r>
     </w:p>
     <w:p>
       <w:pPr>
-        <w:wordWrap w:val="0"/>
-        <w:jc w:val="center"/>
-        <w:rPr>
-          <w:rFonts w:hint="eastAsia" w:ascii="Times New Roman" w:hAnsi="Times New Roman" w:eastAsia="仿宋"/>
-          <w:sz w:val="28"/>
-          <w:szCs w:val="28"/>
-          <w:lang w:eastAsia="zh-CN"/>
-        </w:rPr>
-      </w:pPr>
-    </w:p>
-    <w:p>
-      <w:pPr>
-        <w:wordWrap w:val="0"/>
-        <w:jc w:val="center"/>
-        <w:rPr>
-          <w:rFonts w:hint="eastAsia" w:ascii="Times New Roman" w:hAnsi="Times New Roman" w:eastAsia="仿宋"/>
-          <w:sz w:val="28"/>
-          <w:szCs w:val="28"/>
-          <w:lang w:eastAsia="zh-CN"/>
-        </w:rPr>
-      </w:pPr>
-      <w:r>
-        <w:rPr>
-          <w:rFonts w:ascii="Times New Roman" w:hAnsi="Times New Roman" w:eastAsia="仿宋"/>
-          <w:sz w:val="28"/>
-          <w:szCs w:val="28"/>
+        <w:pStyle w:val="15"/>
+        <w:bidi w:val="0"/>
+        <w:rPr>
+          <w:rFonts w:hint="eastAsia"/>
+          <w:lang w:eastAsia="zh-CN"/>
+        </w:rPr>
+      </w:pPr>
+      <w:r>
+        <w:rPr>
+          <w:rFonts w:hint="eastAsia"/>
+          <w:lang w:eastAsia="zh-CN"/>
+        </w:rPr>
+        <w:t>【在此插入图4】</w:t>
+      </w:r>
+    </w:p>
+    <w:p>
+      <w:pPr>
+        <w:pStyle w:val="14"/>
+        <w:bidi w:val="0"/>
+        <w:rPr>
+          <w:rFonts w:hint="eastAsia"/>
+          <w:lang w:eastAsia="zh-CN"/>
+        </w:rPr>
+      </w:pPr>
+      <w:r>
+        <w:rPr>
+          <w:rFonts w:hint="eastAsia"/>
+          <w:lang w:eastAsia="zh-CN"/>
         </w:rPr>
         <w:t>图5</w:t>
       </w:r>
     </w:p>
     <w:p>
       <w:pPr>
-        <w:wordWrap w:val="0"/>
-        <w:jc w:val="center"/>
-        <w:rPr>
-          <w:rFonts w:hint="eastAsia" w:ascii="Times New Roman" w:hAnsi="Times New Roman" w:eastAsia="仿宋"/>
-          <w:sz w:val="28"/>
-          <w:szCs w:val="28"/>
-          <w:lang w:eastAsia="zh-CN"/>
-        </w:rPr>
-      </w:pPr>
-    </w:p>
-    <w:p>
-      <w:pPr>
-        <w:wordWrap w:val="0"/>
-        <w:jc w:val="center"/>
-        <w:rPr>
-          <w:rFonts w:ascii="Times New Roman" w:hAnsi="Times New Roman" w:eastAsia="仿宋"/>
-          <w:sz w:val="28"/>
-          <w:szCs w:val="28"/>
-        </w:rPr>
-      </w:pPr>
-      <w:r>
-        <w:rPr>
-          <w:rFonts w:ascii="Times New Roman" w:hAnsi="Times New Roman" w:eastAsia="仿宋"/>
-          <w:sz w:val="28"/>
-          <w:szCs w:val="28"/>
+        <w:pStyle w:val="15"/>
+        <w:bidi w:val="0"/>
+        <w:rPr>
+          <w:rFonts w:hint="eastAsia"/>
+          <w:lang w:eastAsia="zh-CN"/>
+        </w:rPr>
+      </w:pPr>
+      <w:r>
+        <w:rPr>
+          <w:rFonts w:hint="eastAsia"/>
+          <w:lang w:eastAsia="zh-CN"/>
+        </w:rPr>
+        <w:t>【在此插入图5】</w:t>
+      </w:r>
+    </w:p>
+    <w:p>
+      <w:pPr>
+        <w:pStyle w:val="14"/>
+        <w:bidi w:val="0"/>
+        <w:rPr>
+          <w:rFonts w:hint="eastAsia"/>
+          <w:lang w:eastAsia="zh-CN"/>
+        </w:rPr>
+      </w:pPr>
+      <w:r>
+        <w:rPr>
+          <w:rFonts w:hint="eastAsia"/>
+          <w:lang w:eastAsia="zh-CN"/>
         </w:rPr>
         <w:t>图6</w:t>
       </w:r>
     </w:p>
     <w:p>
       <w:pPr>
-        <w:wordWrap w:val="0"/>
-        <w:jc w:val="center"/>
-        <w:rPr>
-          <w:rFonts w:hint="eastAsia" w:ascii="Times New Roman" w:hAnsi="Times New Roman" w:eastAsia="仿宋"/>
-          <w:sz w:val="28"/>
-          <w:szCs w:val="28"/>
-          <w:lang w:eastAsia="zh-CN"/>
-        </w:rPr>
-      </w:pPr>
-    </w:p>
-    <w:p>
-      <w:pPr>
-        <w:wordWrap w:val="0"/>
-        <w:jc w:val="center"/>
-        <w:rPr>
-          <w:rFonts w:hint="eastAsia" w:ascii="Times New Roman" w:hAnsi="Times New Roman" w:eastAsia="仿宋"/>
-          <w:sz w:val="28"/>
-          <w:szCs w:val="28"/>
-          <w:lang w:val="en-US" w:eastAsia="zh-CN"/>
-        </w:rPr>
-      </w:pPr>
-      <w:r>
-        <w:rPr>
-          <w:rFonts w:hint="eastAsia" w:ascii="Times New Roman" w:hAnsi="Times New Roman" w:eastAsia="仿宋"/>
-          <w:sz w:val="28"/>
-          <w:szCs w:val="28"/>
+        <w:pStyle w:val="15"/>
+        <w:bidi w:val="0"/>
+        <w:rPr>
+          <w:rFonts w:hint="eastAsia"/>
+          <w:lang w:eastAsia="zh-CN"/>
+        </w:rPr>
+      </w:pPr>
+      <w:r>
+        <w:rPr>
+          <w:rFonts w:hint="eastAsia"/>
+          <w:lang w:eastAsia="zh-CN"/>
+        </w:rPr>
+        <w:t>【在此插入图6】</w:t>
+      </w:r>
+    </w:p>
+    <w:p>
+      <w:pPr>
+        <w:pStyle w:val="14"/>
+        <w:bidi w:val="0"/>
+        <w:rPr>
+          <w:rFonts w:hint="eastAsia"/>
+          <w:lang w:val="en-US" w:eastAsia="zh-CN"/>
+        </w:rPr>
+      </w:pPr>
+      <w:r>
+        <w:rPr>
+          <w:rFonts w:hint="eastAsia"/>
           <w:lang w:val="en-US" w:eastAsia="zh-CN"/>
         </w:rPr>
         <w:t>图7</w:t>
@@ -535,26 +931,33 @@
     </w:p>
     <w:p>
       <w:pPr>
-        <w:wordWrap w:val="0"/>
-        <w:jc w:val="center"/>
-        <w:rPr>
-          <w:rFonts w:hint="eastAsia" w:ascii="Times New Roman" w:hAnsi="Times New Roman" w:eastAsia="仿宋"/>
-          <w:sz w:val="28"/>
-          <w:szCs w:val="28"/>
-          <w:lang w:val="en-US" w:eastAsia="zh-CN"/>
-        </w:rPr>
-      </w:pPr>
-    </w:p>
-    <w:p>
-      <w:pPr>
-        <w:rPr>
-          <w:sz w:val="84"/>
-          <w:szCs w:val="84"/>
+        <w:pStyle w:val="15"/>
+        <w:bidi w:val="0"/>
+        <w:rPr>
+          <w:rFonts w:hint="eastAsia"/>
+          <w:lang w:eastAsia="zh-CN"/>
+        </w:rPr>
+      </w:pPr>
+      <w:r>
+        <w:rPr>
+          <w:rFonts w:hint="eastAsia"/>
+          <w:lang w:eastAsia="zh-CN"/>
+        </w:rPr>
+        <w:t>【在此插入图7】</w:t>
+      </w:r>
+    </w:p>
+    <w:p>
+      <w:pPr>
+        <w:pStyle w:val="15"/>
+        <w:bidi w:val="0"/>
+        <w:rPr>
+          <w:rFonts w:hint="eastAsia"/>
+          <w:lang w:eastAsia="zh-CN"/>
         </w:rPr>
       </w:pPr>
     </w:p>
     <w:sectPr>
-      <w:headerReference r:id="rId9" w:type="default"/>
+      <w:headerReference r:id="rId11" w:type="default"/>
       <w:pgSz w:w="11906" w:h="16838"/>
       <w:pgMar w:top="1418" w:right="851" w:bottom="851" w:left="1418" w:header="851" w:footer="113" w:gutter="0"/>
       <w:pgNumType w:start="1"/>
@@ -563,6 +966,31 @@
     </w:sectPr>
   </w:body>
 </w:document>
+</file>
+
+<file path=word/endnotes.xml><?xml version="1.0" encoding="utf-8"?>
+<w:endnotes xmlns:wpc="http://schemas.microsoft.com/office/word/2010/wordprocessingCanvas" xmlns:mc="http://schemas.openxmlformats.org/markup-compatibility/2006" xmlns:o="urn:schemas-microsoft-com:office:office" xmlns:r="http://schemas.openxmlformats.org/officeDocument/2006/relationships" xmlns:m="http://schemas.openxmlformats.org/officeDocument/2006/math" xmlns:v="urn:schemas-microsoft-com:vml" xmlns:wp14="http://schemas.microsoft.com/office/word/2010/wordprocessingDrawing" xmlns:wp="http://schemas.openxmlformats.org/drawingml/2006/wordprocessingDrawing" xmlns:w="http://schemas.openxmlformats.org/wordprocessingml/2006/main" xmlns:w14="http://schemas.microsoft.com/office/word/2010/wordml" xmlns:w15="http://schemas.microsoft.com/office/word/2012/wordml" xmlns:w10="urn:schemas-microsoft-com:office:word" xmlns:wpg="http://schemas.microsoft.com/office/word/2010/wordprocessingGroup" xmlns:wpi="http://schemas.microsoft.com/office/word/2010/wordprocessingInk" xmlns:wne="http://schemas.microsoft.com/office/word/2006/wordml" xmlns:wps="http://schemas.microsoft.com/office/word/2010/wordprocessingShape" xmlns:wpsCustomData="http://www.wps.cn/officeDocument/2013/wpsCustomData" mc:Ignorable="w14 w15 wp14">
+  <w:endnote w:type="separator" w:id="0">
+    <w:p>
+      <w:pPr>
+        <w:spacing w:line="240" w:lineRule="auto"/>
+      </w:pPr>
+      <w:r>
+        <w:separator/>
+      </w:r>
+    </w:p>
+  </w:endnote>
+  <w:endnote w:type="continuationSeparator" w:id="1">
+    <w:p>
+      <w:pPr>
+        <w:spacing w:line="240" w:lineRule="auto"/>
+      </w:pPr>
+      <w:r>
+        <w:continuationSeparator/>
+      </w:r>
+    </w:p>
+  </w:endnote>
+</w:endnotes>
 </file>
 
 <file path=word/footer1.xml><?xml version="1.0" encoding="utf-8"?>
@@ -724,6 +1152,31 @@
     </w:pPr>
   </w:p>
 </w:ftr>
+</file>
+
+<file path=word/footnotes.xml><?xml version="1.0" encoding="utf-8"?>
+<w:footnotes xmlns:wpc="http://schemas.microsoft.com/office/word/2010/wordprocessingCanvas" xmlns:mc="http://schemas.openxmlformats.org/markup-compatibility/2006" xmlns:o="urn:schemas-microsoft-com:office:office" xmlns:r="http://schemas.openxmlformats.org/officeDocument/2006/relationships" xmlns:m="http://schemas.openxmlformats.org/officeDocument/2006/math" xmlns:v="urn:schemas-microsoft-com:vml" xmlns:wp14="http://schemas.microsoft.com/office/word/2010/wordprocessingDrawing" xmlns:wp="http://schemas.openxmlformats.org/drawingml/2006/wordprocessingDrawing" xmlns:w="http://schemas.openxmlformats.org/wordprocessingml/2006/main" xmlns:w14="http://schemas.microsoft.com/office/word/2010/wordml" xmlns:w15="http://schemas.microsoft.com/office/word/2012/wordml" xmlns:w10="urn:schemas-microsoft-com:office:word" xmlns:wpg="http://schemas.microsoft.com/office/word/2010/wordprocessingGroup" xmlns:wpi="http://schemas.microsoft.com/office/word/2010/wordprocessingInk" xmlns:wne="http://schemas.microsoft.com/office/word/2006/wordml" xmlns:wps="http://schemas.microsoft.com/office/word/2010/wordprocessingShape" xmlns:wpsCustomData="http://www.wps.cn/officeDocument/2013/wpsCustomData" mc:Ignorable="w14 w15 wp14">
+  <w:footnote w:type="separator" w:id="0">
+    <w:p>
+      <w:pPr>
+        <w:spacing w:line="240" w:lineRule="auto"/>
+      </w:pPr>
+      <w:r>
+        <w:separator/>
+      </w:r>
+    </w:p>
+  </w:footnote>
+  <w:footnote w:type="continuationSeparator" w:id="1">
+    <w:p>
+      <w:pPr>
+        <w:spacing w:line="240" w:lineRule="auto"/>
+      </w:pPr>
+      <w:r>
+        <w:continuationSeparator/>
+      </w:r>
+    </w:p>
+  </w:footnote>
+</w:footnotes>
 </file>
 
 <file path=word/header1.xml><?xml version="1.0" encoding="utf-8"?>
@@ -1307,7 +1760,7 @@
   <w:latentStyles w:count="260" w:defQFormat="0" w:defUnhideWhenUsed="1" w:defSemiHidden="1" w:defUIPriority="99" w:defLockedState="0">
     <w:lsdException w:qFormat="1" w:unhideWhenUsed="0" w:uiPriority="0" w:semiHidden="0" w:name="Normal"/>
     <w:lsdException w:qFormat="1" w:unhideWhenUsed="0" w:uiPriority="0" w:semiHidden="0" w:name="heading 1"/>
-    <w:lsdException w:qFormat="1" w:uiPriority="0" w:name="heading 2"/>
+    <w:lsdException w:qFormat="1" w:uiPriority="0" w:semiHidden="0" w:name="heading 2"/>
     <w:lsdException w:qFormat="1" w:uiPriority="0" w:name="heading 3"/>
     <w:lsdException w:qFormat="1" w:uiPriority="0" w:name="heading 4"/>
     <w:lsdException w:qFormat="1" w:uiPriority="0" w:name="heading 5"/>
@@ -1337,7 +1790,7 @@
     <w:lsdException w:unhideWhenUsed="0" w:uiPriority="0" w:semiHidden="0" w:name="footnote text"/>
     <w:lsdException w:unhideWhenUsed="0" w:uiPriority="0" w:semiHidden="0" w:name="annotation text"/>
     <w:lsdException w:unhideWhenUsed="0" w:uiPriority="0" w:semiHidden="0" w:name="header"/>
-    <w:lsdException w:unhideWhenUsed="0" w:uiPriority="99" w:semiHidden="0" w:name="footer"/>
+    <w:lsdException w:qFormat="1" w:unhideWhenUsed="0" w:uiPriority="99" w:semiHidden="0" w:name="footer"/>
     <w:lsdException w:unhideWhenUsed="0" w:uiPriority="0" w:semiHidden="0" w:name="index heading"/>
     <w:lsdException w:qFormat="1" w:uiPriority="0" w:name="caption"/>
     <w:lsdException w:unhideWhenUsed="0" w:uiPriority="0" w:semiHidden="0" w:name="table of figures"/>
@@ -1560,12 +2013,14 @@
     <w:uiPriority w:val="0"/>
     <w:pPr>
       <w:widowControl w:val="0"/>
+      <w:spacing w:line="440" w:lineRule="exact"/>
+      <w:ind w:firstLine="560"/>
       <w:jc w:val="both"/>
     </w:pPr>
     <w:rPr>
-      <w:rFonts w:ascii="Calibri" w:hAnsi="Calibri" w:eastAsia="微软雅黑" w:cs="Times New Roman"/>
+      <w:rFonts w:ascii="Times New Roman" w:hAnsi="Times New Roman" w:eastAsia="仿宋" w:cs="Times New Roman"/>
       <w:kern w:val="2"/>
-      <w:sz w:val="21"/>
+      <w:sz w:val="28"/>
       <w:lang w:val="en-US" w:eastAsia="zh-CN" w:bidi="ar-SA"/>
     </w:rPr>
   </w:style>
@@ -1573,7 +2028,7 @@
     <w:name w:val="heading 1"/>
     <w:basedOn w:val="1"/>
     <w:next w:val="1"/>
-    <w:link w:val="10"/>
+    <w:link w:val="11"/>
     <w:qFormat/>
     <w:uiPriority w:val="0"/>
     <w:pPr>
@@ -1583,19 +2038,15 @@
         <w:ilvl w:val="0"/>
         <w:numId w:val="1"/>
       </w:numPr>
-      <w:ind w:left="425" w:hanging="425" w:firstLineChars="0"/>
+      <w:ind w:left="0" w:firstLine="560" w:firstLineChars="0"/>
       <w:outlineLvl w:val="0"/>
     </w:pPr>
     <w:rPr>
-      <w:rFonts w:ascii="Times New Roman" w:hAnsi="Times New Roman" w:eastAsia="宋体" w:cstheme="majorBidi"/>
-      <w:color w:val="000000" w:themeColor="text1"/>
+      <w:rFonts w:ascii="Times New Roman" w:hAnsi="Times New Roman" w:eastAsia="仿宋" w:cs="Times New Roman"/>
+      <w:b/>
+      <w:color w:val="auto"/>
       <w:sz w:val="28"/>
       <w:szCs w:val="48"/>
-      <w14:textFill>
-        <w14:solidFill>
-          <w14:schemeClr w14:val="tx1"/>
-        </w14:solidFill>
-      </w14:textFill>
       <w14:ligatures w14:val="standardContextual"/>
     </w:rPr>
   </w:style>
@@ -1603,7 +2054,6 @@
     <w:name w:val="heading 2"/>
     <w:basedOn w:val="1"/>
     <w:next w:val="1"/>
-    <w:semiHidden/>
     <w:unhideWhenUsed/>
     <w:qFormat/>
     <w:uiPriority w:val="0"/>
@@ -1614,14 +2064,13 @@
         <w:ilvl w:val="1"/>
         <w:numId w:val="1"/>
       </w:numPr>
-      <w:spacing w:before="260" w:beforeLines="0" w:beforeAutospacing="0" w:after="260" w:afterLines="0" w:afterAutospacing="0" w:line="413" w:lineRule="auto"/>
-      <w:ind w:left="992" w:hanging="567"/>
+      <w:spacing w:beforeLines="0" w:beforeAutospacing="0" w:afterLines="0" w:afterAutospacing="0" w:line="440" w:lineRule="exact"/>
+      <w:ind w:left="0" w:firstLine="560"/>
       <w:outlineLvl w:val="1"/>
     </w:pPr>
     <w:rPr>
-      <w:rFonts w:ascii="Arial" w:hAnsi="Arial" w:eastAsia="黑体"/>
-      <w:b/>
-      <w:sz w:val="32"/>
+      <w:rFonts w:ascii="Times New Roman" w:hAnsi="Times New Roman" w:eastAsia="仿宋"/>
+      <w:sz w:val="28"/>
     </w:rPr>
   </w:style>
   <w:style w:type="paragraph" w:styleId="4">
@@ -1673,13 +2122,13 @@
       <w:sz w:val="28"/>
     </w:rPr>
   </w:style>
-  <w:style w:type="character" w:default="1" w:styleId="8">
+  <w:style w:type="character" w:default="1" w:styleId="9">
     <w:name w:val="Default Paragraph Font"/>
     <w:unhideWhenUsed/>
     <w:qFormat/>
     <w:uiPriority w:val="1"/>
   </w:style>
-  <w:style w:type="table" w:default="1" w:styleId="7">
+  <w:style w:type="table" w:default="1" w:styleId="8">
     <w:name w:val="Normal Table"/>
     <w:semiHidden/>
     <w:qFormat/>
@@ -1696,6 +2145,7 @@
   <w:style w:type="paragraph" w:styleId="6">
     <w:name w:val="footer"/>
     <w:basedOn w:val="1"/>
+    <w:qFormat/>
     <w:uiPriority w:val="99"/>
     <w:pPr>
       <w:tabs>
@@ -1709,32 +2159,80 @@
       <w:sz w:val="18"/>
     </w:rPr>
   </w:style>
-  <w:style w:type="character" w:styleId="9">
+  <w:style w:type="paragraph" w:styleId="7">
+    <w:name w:val="Title"/>
+    <w:basedOn w:val="1"/>
+    <w:qFormat/>
+    <w:uiPriority w:val="0"/>
+    <w:pPr>
+      <w:spacing w:beforeLines="0" w:beforeAutospacing="0" w:afterLines="0" w:afterAutospacing="0"/>
+      <w:jc w:val="center"/>
+      <w:outlineLvl w:val="0"/>
+    </w:pPr>
+    <w:rPr>
+      <w:rFonts w:ascii="Times New Roman" w:hAnsi="Times New Roman"/>
+      <w:sz w:val="28"/>
+    </w:rPr>
+  </w:style>
+  <w:style w:type="character" w:styleId="10">
     <w:name w:val="Strong"/>
-    <w:basedOn w:val="8"/>
+    <w:basedOn w:val="9"/>
     <w:qFormat/>
     <w:uiPriority w:val="0"/>
     <w:rPr>
       <w:b/>
     </w:rPr>
   </w:style>
-  <w:style w:type="character" w:customStyle="1" w:styleId="10">
+  <w:style w:type="character" w:customStyle="1" w:styleId="11">
     <w:name w:val="标题 1 字符"/>
-    <w:basedOn w:val="8"/>
+    <w:basedOn w:val="9"/>
     <w:link w:val="2"/>
     <w:qFormat/>
     <w:uiPriority w:val="9"/>
     <w:rPr>
-      <w:rFonts w:ascii="Times New Roman" w:hAnsi="Times New Roman" w:eastAsia="宋体" w:cstheme="majorBidi"/>
-      <w:color w:val="000000" w:themeColor="text1"/>
+      <w:rFonts w:ascii="Times New Roman" w:hAnsi="Times New Roman" w:eastAsia="仿宋" w:cs="Times New Roman"/>
+      <w:b/>
+      <w:color w:val="auto"/>
       <w:sz w:val="28"/>
       <w:szCs w:val="48"/>
-      <w14:textFill>
-        <w14:solidFill>
-          <w14:schemeClr w14:val="tx1"/>
-        </w14:solidFill>
-      </w14:textFill>
       <w14:ligatures w14:val="standardContextual"/>
+    </w:rPr>
+  </w:style>
+  <w:style w:type="paragraph" w:customStyle="1" w:styleId="12">
+    <w:name w:val="模板权利要求"/>
+    <w:basedOn w:val="1"/>
+    <w:qFormat/>
+    <w:uiPriority w:val="0"/>
+  </w:style>
+  <w:style w:type="paragraph" w:customStyle="1" w:styleId="13">
+    <w:name w:val="模板图题"/>
+    <w:basedOn w:val="1"/>
+    <w:qFormat/>
+    <w:uiPriority w:val="0"/>
+    <w:pPr>
+      <w:jc w:val="center"/>
+    </w:pPr>
+  </w:style>
+  <w:style w:type="paragraph" w:customStyle="1" w:styleId="14">
+    <w:name w:val="模板图号"/>
+    <w:basedOn w:val="1"/>
+    <w:qFormat/>
+    <w:uiPriority w:val="0"/>
+    <w:pPr>
+      <w:jc w:val="center"/>
+    </w:pPr>
+  </w:style>
+  <w:style w:type="paragraph" w:customStyle="1" w:styleId="15">
+    <w:name w:val="模板图片占位"/>
+    <w:basedOn w:val="1"/>
+    <w:qFormat/>
+    <w:uiPriority w:val="0"/>
+    <w:pPr>
+      <w:jc w:val="center"/>
+    </w:pPr>
+    <w:rPr>
+      <w:i/>
+      <w:color w:val="808080"/>
     </w:rPr>
   </w:style>
 </w:styles>

</xml_diff>